<commit_message>
Basic C++ Concepts, Inheritance & Virtual Functions
</commit_message>
<xml_diff>
--- a/LAB08_C++/MUHAMMAD HAMMAD - lab8.docx
+++ b/LAB08_C++/MUHAMMAD HAMMAD - lab8.docx
@@ -402,60 +402,29 @@
           <w:sz w:val="28"/>
           <w:szCs w:val="28"/>
         </w:rPr>
-        <w:t xml:space="preserve">This task implements inheritance by creating a </w:t>
+        <w:t>This task implements inheritance by creating a CommissionEmployee base class and a BasePlusCommissionEmployee derived class. It demonstrates code reuse and method overriding to calculate earnings including base salary and commission.</w:t>
       </w:r>
-      <w:proofErr w:type="spellStart"/>
-      <w:r>
-        <w:rPr>
+    </w:p>
+    <w:p>
+      <w:pPr>
+        <w:ind w:left="144" w:right="144"/>
+        <w:jc w:val="center"/>
+        <w:rPr>
+          <w:b/>
+          <w:sz w:val="32"/>
+        </w:rPr>
+      </w:pPr>
+    </w:p>
+    <w:p>
+      <w:pPr>
+        <w:ind w:left="144" w:right="144"/>
+        <w:jc w:val="center"/>
+        <w:rPr>
+          <w:b/>
           <w:sz w:val="28"/>
-          <w:szCs w:val="28"/>
-        </w:rPr>
-        <w:t>CommissionEmployee</w:t>
-      </w:r>
-      <w:proofErr w:type="spellEnd"/>
-      <w:r>
-        <w:rPr>
-          <w:sz w:val="28"/>
-          <w:szCs w:val="28"/>
-        </w:rPr>
-        <w:t xml:space="preserve"> base class and a </w:t>
-      </w:r>
-      <w:proofErr w:type="spellStart"/>
-      <w:r>
-        <w:rPr>
-          <w:sz w:val="28"/>
-          <w:szCs w:val="28"/>
-        </w:rPr>
-        <w:t>BasePlusCommissionEmployee</w:t>
-      </w:r>
-      <w:proofErr w:type="spellEnd"/>
-      <w:r>
-        <w:rPr>
-          <w:sz w:val="28"/>
-          <w:szCs w:val="28"/>
-        </w:rPr>
-        <w:t xml:space="preserve"> derived class. It demonstrates code reuse and method overriding to calculate earnings including base salary and commission.</w:t>
-      </w:r>
-    </w:p>
-    <w:p>
-      <w:pPr>
-        <w:ind w:left="144" w:right="144"/>
-        <w:jc w:val="center"/>
-        <w:rPr>
-          <w:b/>
-          <w:sz w:val="32"/>
-        </w:rPr>
-      </w:pPr>
-    </w:p>
-    <w:p>
-      <w:pPr>
-        <w:ind w:left="144" w:right="144"/>
-        <w:jc w:val="center"/>
-        <w:rPr>
-          <w:b/>
-          <w:sz w:val="28"/>
-        </w:rPr>
-      </w:pPr>
+        </w:rPr>
+      </w:pPr>
+      <w:bookmarkStart w:id="0" w:name="_GoBack"/>
       <w:r>
         <w:rPr>
           <w:noProof/>
@@ -463,8 +432,8 @@
         <w:drawing>
           <wp:anchor distT="0" distB="0" distL="114300" distR="114300" simplePos="0" relativeHeight="251661312" behindDoc="0" locked="0" layoutInCell="1" allowOverlap="1" wp14:anchorId="2DF775E7" wp14:editId="0972E32E">
             <wp:simplePos x="0" y="0"/>
-            <wp:positionH relativeFrom="margin">
-              <wp:align>left</wp:align>
+            <wp:positionH relativeFrom="page">
+              <wp:align>center</wp:align>
             </wp:positionH>
             <wp:positionV relativeFrom="paragraph">
               <wp:posOffset>414655</wp:posOffset>
@@ -541,6 +510,7 @@
           </wp:anchor>
         </w:drawing>
       </w:r>
+      <w:bookmarkEnd w:id="0"/>
       <w:r>
         <w:rPr>
           <w:b/>
@@ -1222,7 +1192,6 @@
         </w:rPr>
         <w:t xml:space="preserve">This task demonstrates runtime polymorphism by declaring the </w:t>
       </w:r>
-      <w:proofErr w:type="gramStart"/>
       <w:r>
         <w:rPr>
           <w:rStyle w:val="HTMLCode"/>
@@ -1230,17 +1199,7 @@
           <w:sz w:val="28"/>
           <w:szCs w:val="28"/>
         </w:rPr>
-        <w:t>earnings(</w:t>
-      </w:r>
-      <w:proofErr w:type="gramEnd"/>
-      <w:r>
-        <w:rPr>
-          <w:rStyle w:val="HTMLCode"/>
-          <w:rFonts w:ascii="Arial" w:hAnsi="Arial" w:cs="Arial"/>
-          <w:sz w:val="28"/>
-          <w:szCs w:val="28"/>
-        </w:rPr>
-        <w:t>)</w:t>
+        <w:t>earnings()</w:t>
       </w:r>
       <w:r>
         <w:rPr>
@@ -1869,38 +1828,7 @@
           <w:sz w:val="28"/>
           <w:szCs w:val="28"/>
         </w:rPr>
-        <w:t xml:space="preserve">This task develops a menu-driven Student Record Management System using </w:t>
-      </w:r>
-      <w:proofErr w:type="spellStart"/>
-      <w:proofErr w:type="gramStart"/>
-      <w:r>
-        <w:rPr>
-          <w:rFonts w:eastAsia="Times New Roman"/>
-          <w:color w:val="auto"/>
-          <w:sz w:val="28"/>
-          <w:szCs w:val="28"/>
-        </w:rPr>
-        <w:t>std</w:t>
-      </w:r>
-      <w:proofErr w:type="spellEnd"/>
-      <w:r>
-        <w:rPr>
-          <w:rFonts w:eastAsia="Times New Roman"/>
-          <w:color w:val="auto"/>
-          <w:sz w:val="28"/>
-          <w:szCs w:val="28"/>
-        </w:rPr>
-        <w:t>::</w:t>
-      </w:r>
-      <w:proofErr w:type="gramEnd"/>
-      <w:r>
-        <w:rPr>
-          <w:rFonts w:eastAsia="Times New Roman"/>
-          <w:color w:val="auto"/>
-          <w:sz w:val="28"/>
-          <w:szCs w:val="28"/>
-        </w:rPr>
-        <w:t>vector to store multiple student objects. It performs operations like adding, searching, updating, displaying, and sorting student records based on average marks.</w:t>
+        <w:t>This task develops a menu-driven Student Record Management System using std::vector to store multiple student objects. It performs operations like adding, searching, updating, displaying, and sorting student records based on average marks.</w:t>
       </w:r>
     </w:p>
     <w:p>
@@ -2603,16 +2531,7 @@
           <w:sz w:val="28"/>
           <w:szCs w:val="28"/>
         </w:rPr>
-        <w:t xml:space="preserve">This task illustrates the use of </w:t>
-      </w:r>
-      <w:proofErr w:type="gramStart"/>
-      <w:r>
-        <w:rPr>
-          <w:rFonts w:ascii="Arial" w:hAnsi="Arial" w:cs="Arial"/>
-          <w:sz w:val="28"/>
-          <w:szCs w:val="28"/>
-        </w:rPr>
-        <w:t xml:space="preserve">the </w:t>
+        <w:t xml:space="preserve">This task illustrates the use of the </w:t>
       </w:r>
       <w:r>
         <w:rPr>
@@ -2623,32 +2542,13 @@
         </w:rPr>
         <w:t>this</w:t>
       </w:r>
-      <w:proofErr w:type="gramEnd"/>
       <w:r>
         <w:rPr>
           <w:rFonts w:ascii="Arial" w:hAnsi="Arial" w:cs="Arial"/>
           <w:sz w:val="28"/>
           <w:szCs w:val="28"/>
         </w:rPr>
-        <w:t xml:space="preserve"> pointer in a </w:t>
-      </w:r>
-      <w:proofErr w:type="spellStart"/>
-      <w:r>
-        <w:rPr>
-          <w:rFonts w:ascii="Arial" w:hAnsi="Arial" w:cs="Arial"/>
-          <w:sz w:val="28"/>
-          <w:szCs w:val="28"/>
-        </w:rPr>
-        <w:t>BankAccount</w:t>
-      </w:r>
-      <w:proofErr w:type="spellEnd"/>
-      <w:r>
-        <w:rPr>
-          <w:rFonts w:ascii="Arial" w:hAnsi="Arial" w:cs="Arial"/>
-          <w:sz w:val="28"/>
-          <w:szCs w:val="28"/>
-        </w:rPr>
-        <w:t xml:space="preserve"> class to access object members and enable method chaining. It performs deposit, withdrawal, and display operations efficiently using returned </w:t>
+        <w:t xml:space="preserve"> pointer in a BankAccount class to access object members and enable method chaining. It performs deposit, withdrawal, and display operations efficiently using returned </w:t>
       </w:r>
       <w:r>
         <w:rPr>
@@ -2963,8 +2863,6 @@
       <w:pPr>
         <w:ind w:left="0" w:right="144"/>
       </w:pPr>
-      <w:bookmarkStart w:id="0" w:name="_GoBack"/>
-      <w:bookmarkEnd w:id="0"/>
     </w:p>
     <w:p>
       <w:pPr>
@@ -3550,15 +3448,7 @@
           <w:sz w:val="28"/>
           <w:szCs w:val="28"/>
         </w:rPr>
-        <w:t xml:space="preserve">Overall, this lab strengthened the understanding of core C++ OOP concepts including inheritance, virtual functions, dynamic binding, vectors, and </w:t>
-      </w:r>
-      <w:proofErr w:type="gramStart"/>
-      <w:r>
-        <w:rPr>
-          <w:sz w:val="28"/>
-          <w:szCs w:val="28"/>
-        </w:rPr>
-        <w:t xml:space="preserve">the </w:t>
+        <w:t xml:space="preserve">Overall, this lab strengthened the understanding of core C++ OOP concepts including inheritance, virtual functions, dynamic binding, vectors, and the </w:t>
       </w:r>
       <w:r>
         <w:rPr>
@@ -3569,7 +3459,6 @@
         </w:rPr>
         <w:t>this</w:t>
       </w:r>
-      <w:proofErr w:type="gramEnd"/>
       <w:r>
         <w:rPr>
           <w:sz w:val="28"/>
@@ -3748,7 +3637,7 @@
         <w:noProof/>
         <w:sz w:val="22"/>
       </w:rPr>
-      <w:t>12</w:t>
+      <w:t>2</w:t>
     </w:r>
     <w:r>
       <w:rPr>
@@ -6542,7 +6431,7 @@
 </file>
 
 <file path=customXml/itemProps1.xml><?xml version="1.0" encoding="utf-8"?>
-<ds:datastoreItem xmlns:ds="http://schemas.openxmlformats.org/officeDocument/2006/customXml" ds:itemID="{2D7E6DAC-4BD7-47BF-BD3D-714E220FEB94}">
+<ds:datastoreItem xmlns:ds="http://schemas.openxmlformats.org/officeDocument/2006/customXml" ds:itemID="{22003E8D-90D9-458E-B52E-573FADEE2841}">
   <ds:schemaRefs>
     <ds:schemaRef ds:uri="http://schemas.openxmlformats.org/officeDocument/2006/bibliography"/>
   </ds:schemaRefs>

</xml_diff>